<commit_message>
Corregir tablas resumen: renumerar procesos según nueva estructura
Tablas de resumen (¿Sube docs? y ¿Quién inicia?) reordenadas
con la numeración correcta de las 5 categorías.

Co-Authored-By: Claude Opus 4.6 <noreply@anthropic.com>
</commit_message>
<xml_diff>
--- a/Guia_Operativa_SAGA_Completa.docx
+++ b/Guia_Operativa_SAGA_Completa.docx
@@ -17685,7 +17685,7 @@
               <w:rPr>
                 <w:sz w:val="18"/>
               </w:rPr>
-              <w:t>Integración de expedientes e inventario</w:t>
+              <w:t>Gestión de instrucciones y solicitudes</w:t>
             </w:r>
           </w:p>
         </w:tc>
@@ -17713,7 +17713,7 @@
               <w:rPr>
                 <w:sz w:val="18"/>
               </w:rPr>
-              <w:t>Paso 3, Paso 5</w:t>
+              <w:t>Paso 1, Paso 2, Paso 5</w:t>
             </w:r>
           </w:p>
         </w:tc>
@@ -17744,7 +17744,7 @@
               <w:rPr>
                 <w:sz w:val="18"/>
               </w:rPr>
-              <w:t>Glosa de documentos</w:t>
+              <w:t>Atención de solicitudes mediante correos electrónicos institucionales</w:t>
             </w:r>
           </w:p>
         </w:tc>
@@ -17772,7 +17772,7 @@
               <w:rPr>
                 <w:sz w:val="18"/>
               </w:rPr>
-              <w:t>Paso 2, Paso 4</w:t>
+              <w:t>Paso 2</w:t>
             </w:r>
           </w:p>
         </w:tc>
@@ -17803,7 +17803,7 @@
               <w:rPr>
                 <w:sz w:val="18"/>
               </w:rPr>
-              <w:t>Digitalización de expedientes físicos</w:t>
+              <w:t>Integración de expedientes e inventario</w:t>
             </w:r>
           </w:p>
         </w:tc>
@@ -17831,7 +17831,7 @@
               <w:rPr>
                 <w:sz w:val="18"/>
               </w:rPr>
-              <w:t>Paso 2</w:t>
+              <w:t>Paso 3, Paso 5</w:t>
             </w:r>
           </w:p>
         </w:tc>
@@ -17862,33 +17862,33 @@
               <w:rPr>
                 <w:sz w:val="18"/>
               </w:rPr>
-              <w:t>Reintegración de expedientes al Archivo de Trámite</w:t>
-            </w:r>
-          </w:p>
-        </w:tc>
-        <w:tc>
-          <w:tcPr>
-            <w:tcW w:w="2160" w:type="dxa"/>
-          </w:tcPr>
-          <w:p>
-            <w:r>
-              <w:rPr>
-                <w:sz w:val="18"/>
-              </w:rPr>
-              <w:t>No</w:t>
-            </w:r>
-          </w:p>
-        </w:tc>
-        <w:tc>
-          <w:tcPr>
-            <w:tcW w:w="2160" w:type="dxa"/>
-          </w:tcPr>
-          <w:p>
-            <w:r>
-              <w:rPr>
-                <w:sz w:val="18"/>
-              </w:rPr>
-              <w:t>—</w:t>
+              <w:t>Seguimiento de Fichas de Gestión pendientes</w:t>
+            </w:r>
+          </w:p>
+        </w:tc>
+        <w:tc>
+          <w:tcPr>
+            <w:tcW w:w="2160" w:type="dxa"/>
+          </w:tcPr>
+          <w:p>
+            <w:r>
+              <w:rPr>
+                <w:sz w:val="18"/>
+              </w:rPr>
+              <w:t>📎 SÍ</w:t>
+            </w:r>
+          </w:p>
+        </w:tc>
+        <w:tc>
+          <w:tcPr>
+            <w:tcW w:w="2160" w:type="dxa"/>
+          </w:tcPr>
+          <w:p>
+            <w:r>
+              <w:rPr>
+                <w:sz w:val="18"/>
+              </w:rPr>
+              <w:t>Paso 3</w:t>
             </w:r>
           </w:p>
         </w:tc>
@@ -17919,33 +17919,33 @@
               <w:rPr>
                 <w:sz w:val="18"/>
               </w:rPr>
-              <w:t>Generación de Inventario General por Expedientes Trimestral</w:t>
-            </w:r>
-          </w:p>
-        </w:tc>
-        <w:tc>
-          <w:tcPr>
-            <w:tcW w:w="2160" w:type="dxa"/>
-          </w:tcPr>
-          <w:p>
-            <w:r>
-              <w:rPr>
-                <w:sz w:val="18"/>
-              </w:rPr>
-              <w:t>No</w:t>
-            </w:r>
-          </w:p>
-        </w:tc>
-        <w:tc>
-          <w:tcPr>
-            <w:tcW w:w="2160" w:type="dxa"/>
-          </w:tcPr>
-          <w:p>
-            <w:r>
-              <w:rPr>
-                <w:sz w:val="18"/>
-              </w:rPr>
-              <w:t>—</w:t>
+              <w:t>Elaboración de fichas técnicas de valoración documental</w:t>
+            </w:r>
+          </w:p>
+        </w:tc>
+        <w:tc>
+          <w:tcPr>
+            <w:tcW w:w="2160" w:type="dxa"/>
+          </w:tcPr>
+          <w:p>
+            <w:r>
+              <w:rPr>
+                <w:sz w:val="18"/>
+              </w:rPr>
+              <w:t>📎 SÍ</w:t>
+            </w:r>
+          </w:p>
+        </w:tc>
+        <w:tc>
+          <w:tcPr>
+            <w:tcW w:w="2160" w:type="dxa"/>
+          </w:tcPr>
+          <w:p>
+            <w:r>
+              <w:rPr>
+                <w:sz w:val="18"/>
+              </w:rPr>
+              <w:t>Paso 2</w:t>
             </w:r>
           </w:p>
         </w:tc>
@@ -17976,33 +17976,33 @@
               <w:rPr>
                 <w:sz w:val="18"/>
               </w:rPr>
-              <w:t>Consulta electrónica de expediente en AC</w:t>
-            </w:r>
-          </w:p>
-        </w:tc>
-        <w:tc>
-          <w:tcPr>
-            <w:tcW w:w="2160" w:type="dxa"/>
-          </w:tcPr>
-          <w:p>
-            <w:r>
-              <w:rPr>
-                <w:sz w:val="18"/>
-              </w:rPr>
-              <w:t>No</w:t>
-            </w:r>
-          </w:p>
-        </w:tc>
-        <w:tc>
-          <w:tcPr>
-            <w:tcW w:w="2160" w:type="dxa"/>
-          </w:tcPr>
-          <w:p>
-            <w:r>
-              <w:rPr>
-                <w:sz w:val="18"/>
-              </w:rPr>
-              <w:t>—</w:t>
+              <w:t>Identificación de valores secundarios de las series</w:t>
+            </w:r>
+          </w:p>
+        </w:tc>
+        <w:tc>
+          <w:tcPr>
+            <w:tcW w:w="2160" w:type="dxa"/>
+          </w:tcPr>
+          <w:p>
+            <w:r>
+              <w:rPr>
+                <w:sz w:val="18"/>
+              </w:rPr>
+              <w:t>📎 SÍ</w:t>
+            </w:r>
+          </w:p>
+        </w:tc>
+        <w:tc>
+          <w:tcPr>
+            <w:tcW w:w="2160" w:type="dxa"/>
+          </w:tcPr>
+          <w:p>
+            <w:r>
+              <w:rPr>
+                <w:sz w:val="18"/>
+              </w:rPr>
+              <w:t>Paso 2, Paso 4</w:t>
             </w:r>
           </w:p>
         </w:tc>
@@ -18033,7 +18033,7 @@
               <w:rPr>
                 <w:sz w:val="18"/>
               </w:rPr>
-              <w:t>Consulta electrónica de expedientes en AT</w:t>
+              <w:t>Modificación del Cuadro General de Clasificación Archivística</w:t>
             </w:r>
           </w:p>
         </w:tc>
@@ -18090,7 +18090,7 @@
               <w:rPr>
                 <w:sz w:val="18"/>
               </w:rPr>
-              <w:t>Seguimiento de consulta electrónica de expedientes AC</w:t>
+              <w:t>Modificación del Catálogo de Disposición Documental</w:t>
             </w:r>
           </w:p>
         </w:tc>
@@ -18147,7 +18147,7 @@
               <w:rPr>
                 <w:sz w:val="18"/>
               </w:rPr>
-              <w:t>Seguimiento de consulta electrónica de expedientes AT</w:t>
+              <w:t>Préstamo y consulta de expedientes AT</w:t>
             </w:r>
           </w:p>
         </w:tc>
@@ -18204,7 +18204,7 @@
               <w:rPr>
                 <w:sz w:val="18"/>
               </w:rPr>
-              <w:t>Préstamo y consulta de expedientes AT</w:t>
+              <w:t>Seguimiento de préstamo y consulta de expedientes AT</w:t>
             </w:r>
           </w:p>
         </w:tc>
@@ -18261,7 +18261,7 @@
               <w:rPr>
                 <w:sz w:val="18"/>
               </w:rPr>
-              <w:t>Préstamo y consulta de expedientes AC</w:t>
+              <w:t>Solicitud de refrendo de préstamo y consulta AT</w:t>
             </w:r>
           </w:p>
         </w:tc>
@@ -18318,7 +18318,7 @@
               <w:rPr>
                 <w:sz w:val="18"/>
               </w:rPr>
-              <w:t>Seguimiento de préstamo y consulta de expedientes AC</w:t>
+              <w:t>Consulta electrónica de expedientes en AT</w:t>
             </w:r>
           </w:p>
         </w:tc>
@@ -18375,7 +18375,7 @@
               <w:rPr>
                 <w:sz w:val="18"/>
               </w:rPr>
-              <w:t>Seguimiento de préstamo y consulta de expedientes AT</w:t>
+              <w:t>Seguimiento de consulta electrónica de expedientes AT</w:t>
             </w:r>
           </w:p>
         </w:tc>
@@ -18432,7 +18432,7 @@
               <w:rPr>
                 <w:sz w:val="18"/>
               </w:rPr>
-              <w:t>Ampliación extraordinaria del plazo en AC por expediente</w:t>
+              <w:t>Solicitud de refrendo de consulta e-AT</w:t>
             </w:r>
           </w:p>
         </w:tc>
@@ -18489,7 +18489,7 @@
               <w:rPr>
                 <w:sz w:val="18"/>
               </w:rPr>
-              <w:t>Ampliación extraordinaria del plazo en AT por expediente</w:t>
+              <w:t>Préstamo y consulta de expedientes AC</w:t>
             </w:r>
           </w:p>
         </w:tc>
@@ -18546,7 +18546,7 @@
               <w:rPr>
                 <w:sz w:val="18"/>
               </w:rPr>
-              <w:t>Solicitud de refrendo de consulta e-AC</w:t>
+              <w:t>Seguimiento de préstamo y consulta de expedientes AC</w:t>
             </w:r>
           </w:p>
         </w:tc>
@@ -18590,7 +18590,6 @@
               <w:rPr>
                 <w:sz w:val="18"/>
               </w:rPr>
-              <w:lastRenderedPageBreak/>
               <w:t>17</w:t>
             </w:r>
           </w:p>
@@ -18604,7 +18603,7 @@
               <w:rPr>
                 <w:sz w:val="18"/>
               </w:rPr>
-              <w:t>Solicitud de refrendo de consulta e-AT</w:t>
+              <w:t>Solicitud de refrendo de préstamo y consulta AC</w:t>
             </w:r>
           </w:p>
         </w:tc>
@@ -18661,7 +18660,7 @@
               <w:rPr>
                 <w:sz w:val="18"/>
               </w:rPr>
-              <w:t>Solicitud de refrendo de préstamo y consulta AC</w:t>
+              <w:t>Consulta electrónica de expediente en AC</w:t>
             </w:r>
           </w:p>
         </w:tc>
@@ -18718,7 +18717,7 @@
               <w:rPr>
                 <w:sz w:val="18"/>
               </w:rPr>
-              <w:t>Solicitud de refrendo de préstamo y consulta AT</w:t>
+              <w:t>Seguimiento de consulta electrónica de expedientes AC</w:t>
             </w:r>
           </w:p>
         </w:tc>
@@ -18775,7 +18774,7 @@
               <w:rPr>
                 <w:sz w:val="18"/>
               </w:rPr>
-              <w:t>Modificación del Cuadro General de Clasificación Archivística</w:t>
+              <w:t>Solicitud de refrendo de consulta e-AC</w:t>
             </w:r>
           </w:p>
         </w:tc>
@@ -18832,33 +18831,33 @@
               <w:rPr>
                 <w:sz w:val="18"/>
               </w:rPr>
-              <w:t>Modificación del Catálogo de Disposición Documental</w:t>
-            </w:r>
-          </w:p>
-        </w:tc>
-        <w:tc>
-          <w:tcPr>
-            <w:tcW w:w="2160" w:type="dxa"/>
-          </w:tcPr>
-          <w:p>
-            <w:r>
-              <w:rPr>
-                <w:sz w:val="18"/>
-              </w:rPr>
-              <w:t>No</w:t>
-            </w:r>
-          </w:p>
-        </w:tc>
-        <w:tc>
-          <w:tcPr>
-            <w:tcW w:w="2160" w:type="dxa"/>
-          </w:tcPr>
-          <w:p>
-            <w:r>
-              <w:rPr>
-                <w:sz w:val="18"/>
-              </w:rPr>
-              <w:t>—</w:t>
+              <w:t>Transferencia primaria</w:t>
+            </w:r>
+          </w:p>
+        </w:tc>
+        <w:tc>
+          <w:tcPr>
+            <w:tcW w:w="2160" w:type="dxa"/>
+          </w:tcPr>
+          <w:p>
+            <w:r>
+              <w:rPr>
+                <w:sz w:val="18"/>
+              </w:rPr>
+              <w:t>📎 SÍ</w:t>
+            </w:r>
+          </w:p>
+        </w:tc>
+        <w:tc>
+          <w:tcPr>
+            <w:tcW w:w="2160" w:type="dxa"/>
+          </w:tcPr>
+          <w:p>
+            <w:r>
+              <w:rPr>
+                <w:sz w:val="18"/>
+              </w:rPr>
+              <w:t>Paso 1, Paso 3, Paso 8, Paso 9</w:t>
             </w:r>
           </w:p>
         </w:tc>
@@ -18889,7 +18888,7 @@
               <w:rPr>
                 <w:sz w:val="18"/>
               </w:rPr>
-              <w:t>Elaboración de fichas técnicas de valoración documental</w:t>
+              <w:t>Transferencia secundaria — Archivo histórico institucional</w:t>
             </w:r>
           </w:p>
         </w:tc>
@@ -18917,7 +18916,7 @@
               <w:rPr>
                 <w:sz w:val="18"/>
               </w:rPr>
-              <w:t>Paso 2</w:t>
+              <w:t>Paso 1, Paso 3, Paso 8</w:t>
             </w:r>
           </w:p>
         </w:tc>
@@ -18948,7 +18947,7 @@
               <w:rPr>
                 <w:sz w:val="18"/>
               </w:rPr>
-              <w:t>Identificación de valores secundarios de las series</w:t>
+              <w:t>Reintegración de expedientes al Archivo de Trámite</w:t>
             </w:r>
           </w:p>
         </w:tc>
@@ -18963,20 +18962,20 @@
                 <w:color w:val="993C1D"/>
                 <w:sz w:val="18"/>
               </w:rPr>
-              <w:t>📎 SÍ</w:t>
-            </w:r>
-          </w:p>
-        </w:tc>
-        <w:tc>
-          <w:tcPr>
-            <w:tcW w:w="2160" w:type="dxa"/>
-          </w:tcPr>
-          <w:p>
-            <w:r>
-              <w:rPr>
-                <w:sz w:val="18"/>
-              </w:rPr>
-              <w:t>Paso 2, Paso 4</w:t>
+              <w:t>No</w:t>
+            </w:r>
+          </w:p>
+        </w:tc>
+        <w:tc>
+          <w:tcPr>
+            <w:tcW w:w="2160" w:type="dxa"/>
+          </w:tcPr>
+          <w:p>
+            <w:r>
+              <w:rPr>
+                <w:sz w:val="18"/>
+              </w:rPr>
+              <w:t>—</w:t>
             </w:r>
           </w:p>
         </w:tc>
@@ -19007,7 +19006,7 @@
               <w:rPr>
                 <w:sz w:val="18"/>
               </w:rPr>
-              <w:t>Eliminación de DCAI</w:t>
+              <w:t>Digitalización de expedientes físicos</w:t>
             </w:r>
           </w:p>
         </w:tc>
@@ -19035,7 +19034,7 @@
               <w:rPr>
                 <w:sz w:val="18"/>
               </w:rPr>
-              <w:t>Paso 2, Paso 4, Paso 5</w:t>
+              <w:t>Paso 2</w:t>
             </w:r>
           </w:p>
         </w:tc>
@@ -19066,7 +19065,7 @@
               <w:rPr>
                 <w:sz w:val="18"/>
               </w:rPr>
-              <w:t>Transferencia primaria</w:t>
+              <w:t>Eliminación de DCAI</w:t>
             </w:r>
           </w:p>
         </w:tc>
@@ -19094,7 +19093,7 @@
               <w:rPr>
                 <w:sz w:val="18"/>
               </w:rPr>
-              <w:t>Paso 1, Paso 3, Paso 8, Paso 9</w:t>
+              <w:t>Paso 2, Paso 4, Paso 5</w:t>
             </w:r>
           </w:p>
         </w:tc>
@@ -19125,7 +19124,7 @@
               <w:rPr>
                 <w:sz w:val="18"/>
               </w:rPr>
-              <w:t>Transferencia secundaria — Archivo histórico institucional</w:t>
+              <w:t>Glosa de documentos</w:t>
             </w:r>
           </w:p>
         </w:tc>
@@ -19153,7 +19152,7 @@
               <w:rPr>
                 <w:sz w:val="18"/>
               </w:rPr>
-              <w:t>Paso 1, Paso 3, Paso 8</w:t>
+              <w:t>Paso 2, Paso 4</w:t>
             </w:r>
           </w:p>
         </w:tc>
@@ -19184,7 +19183,7 @@
               <w:rPr>
                 <w:sz w:val="18"/>
               </w:rPr>
-              <w:t>Administración y Configuración del Sistema</w:t>
+              <w:t>Ampliación extraordinaria del plazo en AT por expediente</w:t>
             </w:r>
           </w:p>
         </w:tc>
@@ -19199,20 +19198,20 @@
                 <w:color w:val="993C1D"/>
                 <w:sz w:val="18"/>
               </w:rPr>
-              <w:t>📎 SÍ</w:t>
-            </w:r>
-          </w:p>
-        </w:tc>
-        <w:tc>
-          <w:tcPr>
-            <w:tcW w:w="2160" w:type="dxa"/>
-          </w:tcPr>
-          <w:p>
-            <w:r>
-              <w:rPr>
-                <w:sz w:val="18"/>
-              </w:rPr>
-              <w:t>Paso 2, Paso 3</w:t>
+              <w:t>No</w:t>
+            </w:r>
+          </w:p>
+        </w:tc>
+        <w:tc>
+          <w:tcPr>
+            <w:tcW w:w="2160" w:type="dxa"/>
+          </w:tcPr>
+          <w:p>
+            <w:r>
+              <w:rPr>
+                <w:sz w:val="18"/>
+              </w:rPr>
+              <w:t>—</w:t>
             </w:r>
           </w:p>
         </w:tc>
@@ -19243,7 +19242,7 @@
               <w:rPr>
                 <w:sz w:val="18"/>
               </w:rPr>
-              <w:t>Gestión de instrucciones y solicitudes</w:t>
+              <w:t>Generación de Inventario General por Expedientes Trimestral</w:t>
             </w:r>
           </w:p>
         </w:tc>
@@ -19258,20 +19257,20 @@
                 <w:color w:val="993C1D"/>
                 <w:sz w:val="18"/>
               </w:rPr>
-              <w:t>📎 SÍ</w:t>
-            </w:r>
-          </w:p>
-        </w:tc>
-        <w:tc>
-          <w:tcPr>
-            <w:tcW w:w="2160" w:type="dxa"/>
-          </w:tcPr>
-          <w:p>
-            <w:r>
-              <w:rPr>
-                <w:sz w:val="18"/>
-              </w:rPr>
-              <w:t>Paso 1, Paso 2, Paso 5</w:t>
+              <w:t>No</w:t>
+            </w:r>
+          </w:p>
+        </w:tc>
+        <w:tc>
+          <w:tcPr>
+            <w:tcW w:w="2160" w:type="dxa"/>
+          </w:tcPr>
+          <w:p>
+            <w:r>
+              <w:rPr>
+                <w:sz w:val="18"/>
+              </w:rPr>
+              <w:t>—</w:t>
             </w:r>
           </w:p>
         </w:tc>
@@ -19302,7 +19301,7 @@
               <w:rPr>
                 <w:sz w:val="18"/>
               </w:rPr>
-              <w:t>Atención de solicitudes mediante correos electrónicos institucionales</w:t>
+              <w:t>Ampliación extraordinaria del plazo en AC por expediente</w:t>
             </w:r>
           </w:p>
         </w:tc>
@@ -19317,20 +19316,20 @@
                 <w:color w:val="993C1D"/>
                 <w:sz w:val="18"/>
               </w:rPr>
-              <w:t>📎 SÍ</w:t>
-            </w:r>
-          </w:p>
-        </w:tc>
-        <w:tc>
-          <w:tcPr>
-            <w:tcW w:w="2160" w:type="dxa"/>
-          </w:tcPr>
-          <w:p>
-            <w:r>
-              <w:rPr>
-                <w:sz w:val="18"/>
-              </w:rPr>
-              <w:t>Paso 2</w:t>
+              <w:t>No</w:t>
+            </w:r>
+          </w:p>
+        </w:tc>
+        <w:tc>
+          <w:tcPr>
+            <w:tcW w:w="2160" w:type="dxa"/>
+          </w:tcPr>
+          <w:p>
+            <w:r>
+              <w:rPr>
+                <w:sz w:val="18"/>
+              </w:rPr>
+              <w:t>—</w:t>
             </w:r>
           </w:p>
         </w:tc>
@@ -19361,7 +19360,7 @@
               <w:rPr>
                 <w:sz w:val="18"/>
               </w:rPr>
-              <w:t>Seguimiento de Fichas de Gestión pendientes</w:t>
+              <w:t>Administración y Configuración del Sistema</w:t>
             </w:r>
           </w:p>
         </w:tc>
@@ -19389,7 +19388,7 @@
               <w:rPr>
                 <w:sz w:val="18"/>
               </w:rPr>
-              <w:t>Paso 3</w:t>
+              <w:t>Paso 2, Paso 3</w:t>
             </w:r>
           </w:p>
         </w:tc>
@@ -19508,7 +19507,7 @@
               <w:rPr>
                 <w:sz w:val="18"/>
               </w:rPr>
-              <w:t>Integración de expedientes e inventario</w:t>
+              <w:t>Gestión de instrucciones y solicitudes</w:t>
             </w:r>
           </w:p>
         </w:tc>
@@ -19521,7 +19520,7 @@
               <w:rPr>
                 <w:sz w:val="18"/>
               </w:rPr>
-              <w:t>RAT (mario_test)</w:t>
+              <w:t>Registrador (mario_test)</w:t>
             </w:r>
           </w:p>
         </w:tc>
@@ -19552,7 +19551,7 @@
               <w:rPr>
                 <w:sz w:val="18"/>
               </w:rPr>
-              <w:t>Glosa de documentos</w:t>
+              <w:t>Atención de solicitudes mediante correos electrónicos institucionales</w:t>
             </w:r>
           </w:p>
         </w:tc>
@@ -19565,7 +19564,7 @@
               <w:rPr>
                 <w:sz w:val="18"/>
               </w:rPr>
-              <w:t>Solicitante (mario_test)</w:t>
+              <w:t>HWSC (automático)</w:t>
             </w:r>
           </w:p>
         </w:tc>
@@ -19596,7 +19595,7 @@
               <w:rPr>
                 <w:sz w:val="18"/>
               </w:rPr>
-              <w:t>Digitalización de expedientes físicos</w:t>
+              <w:t>Integración de expedientes e inventario</w:t>
             </w:r>
           </w:p>
         </w:tc>
@@ -19609,7 +19608,7 @@
               <w:rPr>
                 <w:sz w:val="18"/>
               </w:rPr>
-              <w:t>Digitalizador (mario_test)</w:t>
+              <w:t>RAT (mario_test)</w:t>
             </w:r>
           </w:p>
         </w:tc>
@@ -19640,7 +19639,7 @@
               <w:rPr>
                 <w:sz w:val="18"/>
               </w:rPr>
-              <w:t>Reintegración de expedientes al Archivo de Trámite</w:t>
+              <w:t>Seguimiento de Fichas de Gestión pendientes</w:t>
             </w:r>
           </w:p>
         </w:tc>
@@ -19653,7 +19652,7 @@
               <w:rPr>
                 <w:sz w:val="18"/>
               </w:rPr>
-              <w:t>Solicitante (mario_test)</w:t>
+              <w:t>Notificador (mario_test)</w:t>
             </w:r>
           </w:p>
         </w:tc>
@@ -19684,7 +19683,7 @@
               <w:rPr>
                 <w:sz w:val="18"/>
               </w:rPr>
-              <w:t>Generación de Inventario General por Expedientes Trimestral</w:t>
+              <w:t>Elaboración de fichas técnicas de valoración documental</w:t>
             </w:r>
           </w:p>
         </w:tc>
@@ -19697,7 +19696,7 @@
               <w:rPr>
                 <w:sz w:val="18"/>
               </w:rPr>
-              <w:t>Generador (mario_test)</w:t>
+              <w:t>Elaborador (mario_test)</w:t>
             </w:r>
           </w:p>
         </w:tc>
@@ -19728,7 +19727,7 @@
               <w:rPr>
                 <w:sz w:val="18"/>
               </w:rPr>
-              <w:t>Consulta electrónica de expediente en AC</w:t>
+              <w:t>Identificación de valores secundarios de las series</w:t>
             </w:r>
           </w:p>
         </w:tc>
@@ -19741,7 +19740,7 @@
               <w:rPr>
                 <w:sz w:val="18"/>
               </w:rPr>
-              <w:t>Solicitante (mario_test)</w:t>
+              <w:t>Verificador (mario_test)</w:t>
             </w:r>
           </w:p>
         </w:tc>
@@ -19772,7 +19771,7 @@
               <w:rPr>
                 <w:sz w:val="18"/>
               </w:rPr>
-              <w:t>Consulta electrónica de expedientes en AT</w:t>
+              <w:t>Modificación del Cuadro General de Clasificación Archivística</w:t>
             </w:r>
           </w:p>
         </w:tc>
@@ -19785,7 +19784,7 @@
               <w:rPr>
                 <w:sz w:val="18"/>
               </w:rPr>
-              <w:t>Solicitante (mario_test)</w:t>
+              <w:t>Editor (mario_test)</w:t>
             </w:r>
           </w:p>
         </w:tc>
@@ -19816,7 +19815,7 @@
               <w:rPr>
                 <w:sz w:val="18"/>
               </w:rPr>
-              <w:t>Seguimiento de consulta electrónica de expedientes AC</w:t>
+              <w:t>Modificación del Catálogo de Disposición Documental</w:t>
             </w:r>
           </w:p>
         </w:tc>
@@ -19829,7 +19828,7 @@
               <w:rPr>
                 <w:sz w:val="18"/>
               </w:rPr>
-              <w:t>Verificador (adrian_test)</w:t>
+              <w:t>Analizador (mario_test)</w:t>
             </w:r>
           </w:p>
         </w:tc>
@@ -19860,7 +19859,7 @@
               <w:rPr>
                 <w:sz w:val="18"/>
               </w:rPr>
-              <w:t>Seguimiento de consulta electrónica de expedientes AT</w:t>
+              <w:t>Préstamo y consulta de expedientes AT</w:t>
             </w:r>
           </w:p>
         </w:tc>
@@ -19873,7 +19872,7 @@
               <w:rPr>
                 <w:sz w:val="18"/>
               </w:rPr>
-              <w:t>Verificador (adrian_test)</w:t>
+              <w:t>Solicitante (mario_test)</w:t>
             </w:r>
           </w:p>
         </w:tc>
@@ -19904,7 +19903,7 @@
               <w:rPr>
                 <w:sz w:val="18"/>
               </w:rPr>
-              <w:t>Préstamo y consulta de expedientes AT</w:t>
+              <w:t>Seguimiento de préstamo y consulta de expedientes AT</w:t>
             </w:r>
           </w:p>
         </w:tc>
@@ -19917,7 +19916,7 @@
               <w:rPr>
                 <w:sz w:val="18"/>
               </w:rPr>
-              <w:t>Solicitante (mario_test)</w:t>
+              <w:t>Verificador (adrian_test)</w:t>
             </w:r>
           </w:p>
         </w:tc>
@@ -19948,7 +19947,7 @@
               <w:rPr>
                 <w:sz w:val="18"/>
               </w:rPr>
-              <w:t>Préstamo y consulta de expedientes AC</w:t>
+              <w:t>Solicitud de refrendo de préstamo y consulta AT</w:t>
             </w:r>
           </w:p>
         </w:tc>
@@ -19992,7 +19991,7 @@
               <w:rPr>
                 <w:sz w:val="18"/>
               </w:rPr>
-              <w:t>Seguimiento de préstamo y consulta de expedientes AC</w:t>
+              <w:t>Consulta electrónica de expedientes en AT</w:t>
             </w:r>
           </w:p>
         </w:tc>
@@ -20005,7 +20004,7 @@
               <w:rPr>
                 <w:sz w:val="18"/>
               </w:rPr>
-              <w:t>Verificador (adrian_test)</w:t>
+              <w:t>Solicitante (mario_test)</w:t>
             </w:r>
           </w:p>
         </w:tc>
@@ -20036,7 +20035,7 @@
               <w:rPr>
                 <w:sz w:val="18"/>
               </w:rPr>
-              <w:t>Seguimiento de préstamo y consulta de expedientes AT</w:t>
+              <w:t>Seguimiento de consulta electrónica de expedientes AT</w:t>
             </w:r>
           </w:p>
         </w:tc>
@@ -20080,7 +20079,7 @@
               <w:rPr>
                 <w:sz w:val="18"/>
               </w:rPr>
-              <w:t>Ampliación extraordinaria del plazo en AC por expediente</w:t>
+              <w:t>Solicitud de refrendo de consulta e-AT</w:t>
             </w:r>
           </w:p>
         </w:tc>
@@ -20124,7 +20123,7 @@
               <w:rPr>
                 <w:sz w:val="18"/>
               </w:rPr>
-              <w:t>Ampliación extraordinaria del plazo en AT por expediente</w:t>
+              <w:t>Préstamo y consulta de expedientes AC</w:t>
             </w:r>
           </w:p>
         </w:tc>
@@ -20168,7 +20167,7 @@
               <w:rPr>
                 <w:sz w:val="18"/>
               </w:rPr>
-              <w:t>Solicitud de refrendo de consulta e-AC</w:t>
+              <w:t>Seguimiento de préstamo y consulta de expedientes AC</w:t>
             </w:r>
           </w:p>
         </w:tc>
@@ -20181,7 +20180,7 @@
               <w:rPr>
                 <w:sz w:val="18"/>
               </w:rPr>
-              <w:t>Solicitante (mario_test)</w:t>
+              <w:t>Verificador (adrian_test)</w:t>
             </w:r>
           </w:p>
         </w:tc>
@@ -20212,7 +20211,7 @@
               <w:rPr>
                 <w:sz w:val="18"/>
               </w:rPr>
-              <w:t>Solicitud de refrendo de consulta e-AT</w:t>
+              <w:t>Solicitud de refrendo de préstamo y consulta AC</w:t>
             </w:r>
           </w:p>
         </w:tc>
@@ -20256,7 +20255,7 @@
               <w:rPr>
                 <w:sz w:val="18"/>
               </w:rPr>
-              <w:t>Solicitud de refrendo de préstamo y consulta AC</w:t>
+              <w:t>Consulta electrónica de expediente en AC</w:t>
             </w:r>
           </w:p>
         </w:tc>
@@ -20300,7 +20299,7 @@
               <w:rPr>
                 <w:sz w:val="18"/>
               </w:rPr>
-              <w:t>Solicitud de refrendo de préstamo y consulta AT</w:t>
+              <w:t>Seguimiento de consulta electrónica de expedientes AC</w:t>
             </w:r>
           </w:p>
         </w:tc>
@@ -20313,7 +20312,7 @@
               <w:rPr>
                 <w:sz w:val="18"/>
               </w:rPr>
-              <w:t>Solicitante (mario_test)</w:t>
+              <w:t>Verificador (adrian_test)</w:t>
             </w:r>
           </w:p>
         </w:tc>
@@ -20344,7 +20343,7 @@
               <w:rPr>
                 <w:sz w:val="18"/>
               </w:rPr>
-              <w:t>Modificación del Cuadro General de Clasificación Archivística</w:t>
+              <w:t>Solicitud de refrendo de consulta e-AC</w:t>
             </w:r>
           </w:p>
         </w:tc>
@@ -20357,7 +20356,7 @@
               <w:rPr>
                 <w:sz w:val="18"/>
               </w:rPr>
-              <w:t>Editor (mario_test)</w:t>
+              <w:t>Solicitante (mario_test)</w:t>
             </w:r>
           </w:p>
         </w:tc>
@@ -20375,7 +20374,6 @@
               <w:rPr>
                 <w:sz w:val="18"/>
               </w:rPr>
-              <w:lastRenderedPageBreak/>
               <w:t>21</w:t>
             </w:r>
           </w:p>
@@ -20389,7 +20387,7 @@
               <w:rPr>
                 <w:sz w:val="18"/>
               </w:rPr>
-              <w:t>Modificación del Catálogo de Disposición Documental</w:t>
+              <w:t>Transferencia primaria</w:t>
             </w:r>
           </w:p>
         </w:tc>
@@ -20402,7 +20400,7 @@
               <w:rPr>
                 <w:sz w:val="18"/>
               </w:rPr>
-              <w:t>Analizador (mario_test)</w:t>
+              <w:t>RAT (mario_test)</w:t>
             </w:r>
           </w:p>
         </w:tc>
@@ -20433,7 +20431,7 @@
               <w:rPr>
                 <w:sz w:val="18"/>
               </w:rPr>
-              <w:t>Elaboración de fichas técnicas de valoración documental</w:t>
+              <w:t>Transferencia secundaria — Archivo histórico institucional</w:t>
             </w:r>
           </w:p>
         </w:tc>
@@ -20446,7 +20444,7 @@
               <w:rPr>
                 <w:sz w:val="18"/>
               </w:rPr>
-              <w:t>Elaborador (mario_test)</w:t>
+              <w:t>RAC (mario_test)</w:t>
             </w:r>
           </w:p>
         </w:tc>
@@ -20477,7 +20475,7 @@
               <w:rPr>
                 <w:sz w:val="18"/>
               </w:rPr>
-              <w:t>Identificación de valores secundarios de las series</w:t>
+              <w:t>Reintegración de expedientes al Archivo de Trámite</w:t>
             </w:r>
           </w:p>
         </w:tc>
@@ -20490,7 +20488,7 @@
               <w:rPr>
                 <w:sz w:val="18"/>
               </w:rPr>
-              <w:t>Verificador (mario_test)</w:t>
+              <w:t>Solicitante (mario_test)</w:t>
             </w:r>
           </w:p>
         </w:tc>
@@ -20521,7 +20519,7 @@
               <w:rPr>
                 <w:sz w:val="18"/>
               </w:rPr>
-              <w:t>Eliminación de DCAI</w:t>
+              <w:t>Digitalización de expedientes físicos</w:t>
             </w:r>
           </w:p>
         </w:tc>
@@ -20534,7 +20532,7 @@
               <w:rPr>
                 <w:sz w:val="18"/>
               </w:rPr>
-              <w:t>Identificador (mario_test)</w:t>
+              <w:t>Digitalizador (mario_test)</w:t>
             </w:r>
           </w:p>
         </w:tc>
@@ -20565,7 +20563,7 @@
               <w:rPr>
                 <w:sz w:val="18"/>
               </w:rPr>
-              <w:t>Transferencia primaria</w:t>
+              <w:t>Eliminación de DCAI</w:t>
             </w:r>
           </w:p>
         </w:tc>
@@ -20578,7 +20576,7 @@
               <w:rPr>
                 <w:sz w:val="18"/>
               </w:rPr>
-              <w:t>RAT (mario_test)</w:t>
+              <w:t>Identificador (mario_test)</w:t>
             </w:r>
           </w:p>
         </w:tc>
@@ -20609,7 +20607,7 @@
               <w:rPr>
                 <w:sz w:val="18"/>
               </w:rPr>
-              <w:t>Transferencia secundaria — Archivo histórico institucional</w:t>
+              <w:t>Glosa de documentos</w:t>
             </w:r>
           </w:p>
         </w:tc>
@@ -20622,7 +20620,7 @@
               <w:rPr>
                 <w:sz w:val="18"/>
               </w:rPr>
-              <w:t>RAC (mario_test)</w:t>
+              <w:t>Solicitante (mario_test)</w:t>
             </w:r>
           </w:p>
         </w:tc>
@@ -20653,7 +20651,7 @@
               <w:rPr>
                 <w:sz w:val="18"/>
               </w:rPr>
-              <w:t>Administración y Configuración del Sistema</w:t>
+              <w:t>Ampliación extraordinaria del plazo en AT por expediente</w:t>
             </w:r>
           </w:p>
         </w:tc>
@@ -20666,7 +20664,7 @@
               <w:rPr>
                 <w:sz w:val="18"/>
               </w:rPr>
-              <w:t>Administrador</w:t>
+              <w:t>Solicitante (mario_test)</w:t>
             </w:r>
           </w:p>
         </w:tc>
@@ -20697,7 +20695,7 @@
               <w:rPr>
                 <w:sz w:val="18"/>
               </w:rPr>
-              <w:t>Gestión de instrucciones y solicitudes</w:t>
+              <w:t>Generación de Inventario General por Expedientes Trimestral</w:t>
             </w:r>
           </w:p>
         </w:tc>
@@ -20710,7 +20708,7 @@
               <w:rPr>
                 <w:sz w:val="18"/>
               </w:rPr>
-              <w:t>Registrador (mario_test)</w:t>
+              <w:t>Generador (mario_test)</w:t>
             </w:r>
           </w:p>
         </w:tc>
@@ -20741,7 +20739,7 @@
               <w:rPr>
                 <w:sz w:val="18"/>
               </w:rPr>
-              <w:t>Atención de solicitudes mediante correos electrónicos institucionales</w:t>
+              <w:t>Ampliación extraordinaria del plazo en AC por expediente</w:t>
             </w:r>
           </w:p>
         </w:tc>
@@ -20754,7 +20752,7 @@
               <w:rPr>
                 <w:sz w:val="18"/>
               </w:rPr>
-              <w:t>HWSC (automático)</w:t>
+              <w:t>Solicitante (mario_test)</w:t>
             </w:r>
           </w:p>
         </w:tc>
@@ -20785,7 +20783,7 @@
               <w:rPr>
                 <w:sz w:val="18"/>
               </w:rPr>
-              <w:t>Seguimiento de Fichas de Gestión pendientes</w:t>
+              <w:t>Administración y Configuración del Sistema</w:t>
             </w:r>
           </w:p>
         </w:tc>
@@ -20798,7 +20796,7 @@
               <w:rPr>
                 <w:sz w:val="18"/>
               </w:rPr>
-              <w:t>Notificador (mario_test)</w:t>
+              <w:t>Administrador</w:t>
             </w:r>
           </w:p>
         </w:tc>

</xml_diff>